<commit_message>
Docs Chain Phase 2+3: node adapters (markdown/pandoc-html/weasyprint-pdf/docx/sqlite) + FileStore + propagation orchestrator (atomic rename, rollback-on-error, cycle-guard, sync-conflict) + integration tests. Phases 4-7 PLANNED.
</commit_message>
<xml_diff>
--- a/README.docx
+++ b/README.docx
@@ -26,7 +26,7 @@
         <w:t xml:space="preserve"> </w:t>
       </w:r>
       <w:r>
-        <w:t xml:space="preserve">1</w:t>
+        <w:t xml:space="preserve">2</w:t>
       </w:r>
       <w:r>
         <w:t xml:space="preserve"> </w:t>
@@ -42,7 +42,7 @@
         <w:t xml:space="preserve"> </w:t>
       </w:r>
       <w:r>
-        <w:t xml:space="preserve">2026-05-29T08:59:39Z</w:t>
+        <w:t xml:space="preserve">2026-05-29T09:30:00Z</w:t>
       </w:r>
       <w:r>
         <w:t xml:space="preserve"> </w:t>
@@ -58,7 +58,7 @@
         <w:t xml:space="preserve"> </w:t>
       </w:r>
       <w:r>
-        <w:t xml:space="preserve">Phase 1 core engine IMPLEMENTED + tested (</w:t>
+        <w:t xml:space="preserve">Docs Chain Phases 1–3 IMPLEMENTED + tested (</w:t>
       </w:r>
       <w:r>
         <w:rPr>
@@ -85,6 +85,36 @@
         <w:t xml:space="preserve"> </w:t>
       </w:r>
       <w:r>
+        <w:t xml:space="preserve">+</w:t>
+      </w:r>
+      <w:r>
+        <w:t xml:space="preserve"> </w:t>
+      </w:r>
+      <w:r>
+        <w:rPr>
+          <w:rStyle w:val="VerbatimChar"/>
+        </w:rPr>
+        <w:t xml:space="preserve">internal/adapter</w:t>
+      </w:r>
+      <w:r>
+        <w:t xml:space="preserve"> </w:t>
+      </w:r>
+      <w:r>
+        <w:t xml:space="preserve">+</w:t>
+      </w:r>
+      <w:r>
+        <w:t xml:space="preserve"> </w:t>
+      </w:r>
+      <w:r>
+        <w:rPr>
+          <w:rStyle w:val="VerbatimChar"/>
+        </w:rPr>
+        <w:t xml:space="preserve">internal/orchestrator</w:t>
+      </w:r>
+      <w:r>
+        <w:t xml:space="preserve"> </w:t>
+      </w:r>
+      <w:r>
         <w:t xml:space="preserve">—</w:t>
       </w:r>
       <w:r>
@@ -100,7 +130,7 @@
         <w:t xml:space="preserve"> </w:t>
       </w:r>
       <w:r>
-        <w:t xml:space="preserve">passes). Phases 2–7 PLANNED per the plan. This README and the docs under</w:t>
+        <w:t xml:space="preserve">passes). Phases 4–7 PLANNED per the plan. This README and the docs under</w:t>
       </w:r>
       <w:r>
         <w:t xml:space="preserve"> </w:t>
@@ -227,7 +257,7 @@
         <w:pStyle w:val="BodyText"/>
       </w:pPr>
       <w:r>
-        <w:t xml:space="preserve">It is the mechanical successor to the project's ad-hoc documentation-sync</w:t>
+        <w:t xml:space="preserve">It is the mechanical successor to the project’s ad-hoc documentation-sync</w:t>
       </w:r>
       <w:r>
         <w:t xml:space="preserve"> </w:t>
@@ -314,13 +344,14 @@
     <w:tbl>
       <w:tblPr>
         <w:tblStyle w:val="Table"/>
-        <w:tblW w:type="auto" w:w="0"/>
+        <w:tblW w:type="pct" w:w="5000"/>
+        <w:tblLayout w:type="fixed"/>
         <w:tblLook w:firstRow="1" w:lastRow="0" w:firstColumn="0" w:lastColumn="0" w:noHBand="0" w:noVBand="0" w:val="0020"/>
       </w:tblPr>
       <w:tblGrid>
-        <w:gridCol w:w="2640"/>
-        <w:gridCol w:w="2640"/>
-        <w:gridCol w:w="2640"/>
+        <w:gridCol w:w="2520"/>
+        <w:gridCol w:w="2520"/>
+        <w:gridCol w:w="2880"/>
       </w:tblGrid>
       <w:tr>
         <w:trPr>
@@ -491,7 +522,26 @@
               <w:pStyle w:val="Compact"/>
             </w:pPr>
             <w:r>
-              <w:t xml:space="preserve">PLANNED</w:t>
+              <w:rPr>
+                <w:b/>
+                <w:bCs/>
+              </w:rPr>
+              <w:t xml:space="preserve">IMPLEMENTED + tested</w:t>
+            </w:r>
+            <w:r>
+              <w:t xml:space="preserve"> </w:t>
+            </w:r>
+            <w:r>
+              <w:t xml:space="preserve">(</w:t>
+            </w:r>
+            <w:r>
+              <w:rPr>
+                <w:rStyle w:val="VerbatimChar"/>
+              </w:rPr>
+              <w:t xml:space="preserve">internal/adapter</w:t>
+            </w:r>
+            <w:r>
+              <w:t xml:space="preserve">)</w:t>
             </w:r>
           </w:p>
         </w:tc>
@@ -526,7 +576,26 @@
               <w:pStyle w:val="Compact"/>
             </w:pPr>
             <w:r>
-              <w:t xml:space="preserve">PLANNED</w:t>
+              <w:rPr>
+                <w:b/>
+                <w:bCs/>
+              </w:rPr>
+              <w:t xml:space="preserve">IMPLEMENTED + tested</w:t>
+            </w:r>
+            <w:r>
+              <w:t xml:space="preserve"> </w:t>
+            </w:r>
+            <w:r>
+              <w:t xml:space="preserve">(</w:t>
+            </w:r>
+            <w:r>
+              <w:rPr>
+                <w:rStyle w:val="VerbatimChar"/>
+              </w:rPr>
+              <w:t xml:space="preserve">internal/orchestrator</w:t>
+            </w:r>
+            <w:r>
+              <w:t xml:space="preserve">)</w:t>
             </w:r>
           </w:p>
         </w:tc>
@@ -585,7 +654,7 @@
               <w:pStyle w:val="Compact"/>
             </w:pPr>
             <w:r>
-              <w:t xml:space="preserve">Comprehensive test suite (beyond the Phase 1 unit tests)</w:t>
+              <w:t xml:space="preserve">Comprehensive test suite (beyond the Phase 1–3 package tests)</w:t>
             </w:r>
           </w:p>
         </w:tc>
@@ -672,7 +741,7 @@
         </w:tc>
       </w:tr>
     </w:tbl>
-    <w:bookmarkStart w:id="10" w:name="Xa2ec077f2df9c4423ac7b003fed1e38d79d726c"/>
+    <w:bookmarkStart w:id="10" w:name="X2ef1cb05e63d960bfc25053575cdd9e6287985f"/>
     <w:p>
       <w:pPr>
         <w:pStyle w:val="Heading3"/>
@@ -992,18 +1061,523 @@
         <w:t xml:space="preserve">) backs the unit tests.</w:t>
       </w:r>
     </w:p>
-    <w:bookmarkEnd w:id="10"/>
-    <w:bookmarkStart w:id="11" w:name="X112a95b96d162fa8c4828f6d47f20c937c102b9"/>
     <w:p>
       <w:pPr>
-        <w:pStyle w:val="Heading3"/>
-      </w:pPr>
-      <w:r>
-        <w:t xml:space="preserve">What is PLANNED (NOT yet functional — do not assume working behaviour)</w:t>
+        <w:pStyle w:val="Compact"/>
+        <w:numPr>
+          <w:ilvl w:val="0"/>
+          <w:numId w:val="1001"/>
+        </w:numPr>
+      </w:pPr>
+      <w:r>
+        <w:rPr>
+          <w:rStyle w:val="VerbatimChar"/>
+          <w:b/>
+          <w:bCs/>
+        </w:rPr>
+        <w:t xml:space="preserve">internal/adapter</w:t>
+      </w:r>
+      <w:r>
+        <w:t xml:space="preserve"> </w:t>
+      </w:r>
+      <w:r>
+        <w:t xml:space="preserve">(Phase 2) — node-content adapters backing real</w:t>
+      </w:r>
+      <w:r>
+        <w:t xml:space="preserve"> </w:t>
+      </w:r>
+      <w:r>
+        <w:t xml:space="preserve">stores: a</w:t>
+      </w:r>
+      <w:r>
+        <w:t xml:space="preserve"> </w:t>
+      </w:r>
+      <w:r>
+        <w:rPr>
+          <w:rStyle w:val="VerbatimChar"/>
+        </w:rPr>
+        <w:t xml:space="preserve">FileAdapter</w:t>
+      </w:r>
+      <w:r>
+        <w:t xml:space="preserve"> </w:t>
+      </w:r>
+      <w:r>
+        <w:t xml:space="preserve">for</w:t>
+      </w:r>
+      <w:r>
+        <w:t xml:space="preserve"> </w:t>
+      </w:r>
+      <w:r>
+        <w:rPr>
+          <w:rStyle w:val="VerbatimChar"/>
+        </w:rPr>
+        <w:t xml:space="preserve">markdown</w:t>
+      </w:r>
+      <w:r>
+        <w:t xml:space="preserve"> </w:t>
+      </w:r>
+      <w:r>
+        <w:t xml:space="preserve">(and the on-disk html/pdf/docx</w:t>
+      </w:r>
+      <w:r>
+        <w:t xml:space="preserve"> </w:t>
+      </w:r>
+      <w:r>
+        <w:t xml:space="preserve">outputs) with per-file atomic temp-then-rename writes; DERIVED transforms</w:t>
+      </w:r>
+      <w:r>
+        <w:t xml:space="preserve"> </w:t>
+      </w:r>
+      <w:r>
+        <w:t xml:space="preserve">that shell out to</w:t>
+      </w:r>
+      <w:r>
+        <w:t xml:space="preserve"> </w:t>
+      </w:r>
+      <w:r>
+        <w:rPr>
+          <w:b/>
+          <w:bCs/>
+        </w:rPr>
+        <w:t xml:space="preserve">pandoc</w:t>
+      </w:r>
+      <w:r>
+        <w:t xml:space="preserve"> </w:t>
+      </w:r>
+      <w:r>
+        <w:t xml:space="preserve">(</w:t>
+      </w:r>
+      <w:r>
+        <w:rPr>
+          <w:rStyle w:val="VerbatimChar"/>
+        </w:rPr>
+        <w:t xml:space="preserve">md→html</w:t>
+      </w:r>
+      <w:r>
+        <w:t xml:space="preserve">,</w:t>
+      </w:r>
+      <w:r>
+        <w:t xml:space="preserve"> </w:t>
+      </w:r>
+      <w:r>
+        <w:rPr>
+          <w:rStyle w:val="VerbatimChar"/>
+        </w:rPr>
+        <w:t xml:space="preserve">md→docx</w:t>
+      </w:r>
+      <w:r>
+        <w:t xml:space="preserve">) and</w:t>
+      </w:r>
+      <w:r>
+        <w:t xml:space="preserve"> </w:t>
+      </w:r>
+      <w:r>
+        <w:rPr>
+          <w:b/>
+          <w:bCs/>
+        </w:rPr>
+        <w:t xml:space="preserve">weasyprint</w:t>
+      </w:r>
+      <w:r>
+        <w:t xml:space="preserve"> </w:t>
+      </w:r>
+      <w:r>
+        <w:t xml:space="preserve">(</w:t>
+      </w:r>
+      <w:r>
+        <w:rPr>
+          <w:rStyle w:val="VerbatimChar"/>
+        </w:rPr>
+        <w:t xml:space="preserve">html→pdf</w:t>
+      </w:r>
+      <w:r>
+        <w:t xml:space="preserve">) — when a tool is absent they return a typed</w:t>
+      </w:r>
+      <w:r>
+        <w:t xml:space="preserve"> </w:t>
+      </w:r>
+      <w:r>
+        <w:rPr>
+          <w:rStyle w:val="VerbatimChar"/>
+        </w:rPr>
+        <w:t xml:space="preserve">ToolAbsentError</w:t>
+      </w:r>
+      <w:r>
+        <w:t xml:space="preserve"> </w:t>
+      </w:r>
+      <w:r>
+        <w:t xml:space="preserve">(</w:t>
+      </w:r>
+      <w:r>
+        <w:rPr>
+          <w:rStyle w:val="VerbatimChar"/>
+        </w:rPr>
+        <w:t xml:space="preserve">IsToolAbsent</w:t>
+      </w:r>
+      <w:r>
+        <w:t xml:space="preserve">) and never fake success; a</w:t>
+      </w:r>
+      <w:r>
+        <w:t xml:space="preserve"> </w:t>
+      </w:r>
+      <w:r>
+        <w:rPr>
+          <w:rStyle w:val="VerbatimChar"/>
+        </w:rPr>
+        <w:t xml:space="preserve">SQLiteAdapter</w:t>
+      </w:r>
+      <w:r>
+        <w:t xml:space="preserve"> </w:t>
+      </w:r>
+      <w:r>
+        <w:t xml:space="preserve">(pure-Go</w:t>
+      </w:r>
+      <w:r>
+        <w:t xml:space="preserve"> </w:t>
+      </w:r>
+      <w:r>
+        <w:rPr>
+          <w:rStyle w:val="VerbatimChar"/>
+        </w:rPr>
+        <w:t xml:space="preserve">modernc.org/sqlite</w:t>
+      </w:r>
+      <w:r>
+        <w:t xml:space="preserve">, no cgo) whose hashed content is a</w:t>
+      </w:r>
+      <w:r>
+        <w:t xml:space="preserve"> </w:t>
+      </w:r>
+      <w:r>
+        <w:rPr>
+          <w:b/>
+          <w:bCs/>
+        </w:rPr>
+        <w:t xml:space="preserve">canonical row dump</w:t>
+      </w:r>
+      <w:r>
+        <w:t xml:space="preserve"> </w:t>
+      </w:r>
+      <w:r>
+        <w:t xml:space="preserve">from a deterministic</w:t>
+      </w:r>
+      <w:r>
+        <w:t xml:space="preserve"> </w:t>
+      </w:r>
+      <w:r>
+        <w:rPr>
+          <w:rStyle w:val="VerbatimChar"/>
+        </w:rPr>
+        <w:t xml:space="preserve">ORDER BY</w:t>
+      </w:r>
+      <w:r>
+        <w:t xml:space="preserve"> </w:t>
+      </w:r>
+      <w:r>
+        <w:t xml:space="preserve">query — NOT the raw</w:t>
+      </w:r>
+      <w:r>
+        <w:t xml:space="preserve"> </w:t>
+      </w:r>
+      <w:r>
+        <w:rPr>
+          <w:rStyle w:val="VerbatimChar"/>
+        </w:rPr>
+        <w:t xml:space="preserve">.db</w:t>
+      </w:r>
+      <w:r>
+        <w:t xml:space="preserve"> </w:t>
+      </w:r>
+      <w:r>
+        <w:t xml:space="preserve">page bytes — so identical row sets collide regardless of insert</w:t>
+      </w:r>
+      <w:r>
+        <w:t xml:space="preserve"> </w:t>
+      </w:r>
+      <w:r>
+        <w:t xml:space="preserve">order; and a</w:t>
+      </w:r>
+      <w:r>
+        <w:t xml:space="preserve"> </w:t>
+      </w:r>
+      <w:r>
+        <w:rPr>
+          <w:rStyle w:val="VerbatimChar"/>
+        </w:rPr>
+        <w:t xml:space="preserve">FileStore</w:t>
+      </w:r>
+      <w:r>
+        <w:t xml:space="preserve"> </w:t>
+      </w:r>
+      <w:r>
+        <w:t xml:space="preserve">implementing the Phase-1</w:t>
+      </w:r>
+      <w:r>
+        <w:t xml:space="preserve"> </w:t>
+      </w:r>
+      <w:r>
+        <w:rPr>
+          <w:rStyle w:val="VerbatimChar"/>
+        </w:rPr>
+        <w:t xml:space="preserve">graph.Store</w:t>
+      </w:r>
+      <w:r>
+        <w:t xml:space="preserve"> </w:t>
+      </w:r>
+      <w:r>
+        <w:t xml:space="preserve">interface</w:t>
+      </w:r>
+      <w:r>
+        <w:t xml:space="preserve"> </w:t>
+      </w:r>
+      <w:r>
+        <w:t xml:space="preserve">on top of these adapters, so</w:t>
+      </w:r>
+      <w:r>
+        <w:t xml:space="preserve"> </w:t>
+      </w:r>
+      <w:r>
+        <w:rPr>
+          <w:rStyle w:val="VerbatimChar"/>
+        </w:rPr>
+        <w:t xml:space="preserve">graph.Recompute</w:t>
+      </w:r>
+      <w:r>
+        <w:t xml:space="preserve"> </w:t>
+      </w:r>
+      <w:r>
+        <w:t xml:space="preserve">runs unmodified against real</w:t>
+      </w:r>
+      <w:r>
+        <w:t xml:space="preserve"> </w:t>
+      </w:r>
+      <w:r>
+        <w:t xml:space="preserve">files and databases.</w:t>
       </w:r>
     </w:p>
     <w:p>
       <w:pPr>
+        <w:pStyle w:val="Compact"/>
+        <w:numPr>
+          <w:ilvl w:val="0"/>
+          <w:numId w:val="1001"/>
+        </w:numPr>
+      </w:pPr>
+      <w:r>
+        <w:rPr>
+          <w:rStyle w:val="VerbatimChar"/>
+          <w:b/>
+          <w:bCs/>
+        </w:rPr>
+        <w:t xml:space="preserve">internal/orchestrator</w:t>
+      </w:r>
+      <w:r>
+        <w:t xml:space="preserve"> </w:t>
+      </w:r>
+      <w:r>
+        <w:t xml:space="preserve">(Phase 3) —</w:t>
+      </w:r>
+      <w:r>
+        <w:t xml:space="preserve"> </w:t>
+      </w:r>
+      <w:r>
+        <w:rPr>
+          <w:rStyle w:val="VerbatimChar"/>
+        </w:rPr>
+        <w:t xml:space="preserve">Run</w:t>
+      </w:r>
+      <w:r>
+        <w:t xml:space="preserve"> </w:t>
+      </w:r>
+      <w:r>
+        <w:t xml:space="preserve">ties</w:t>
+      </w:r>
+      <w:r>
+        <w:t xml:space="preserve"> </w:t>
+      </w:r>
+      <w:r>
+        <w:rPr>
+          <w:rStyle w:val="VerbatimChar"/>
+        </w:rPr>
+        <w:t xml:space="preserve">graph.Recompute</w:t>
+      </w:r>
+      <w:r>
+        <w:t xml:space="preserve"> </w:t>
+      </w:r>
+      <w:r>
+        <w:t xml:space="preserve">to the</w:t>
+      </w:r>
+      <w:r>
+        <w:t xml:space="preserve"> </w:t>
+      </w:r>
+      <w:r>
+        <w:rPr>
+          <w:rStyle w:val="VerbatimChar"/>
+        </w:rPr>
+        <w:t xml:space="preserve">FileStore</w:t>
+      </w:r>
+      <w:r>
+        <w:t xml:space="preserve"> </w:t>
+      </w:r>
+      <w:r>
+        <w:t xml:space="preserve">with three guarantees:</w:t>
+      </w:r>
+      <w:r>
+        <w:t xml:space="preserve"> </w:t>
+      </w:r>
+      <w:r>
+        <w:rPr>
+          <w:b/>
+          <w:bCs/>
+        </w:rPr>
+        <w:t xml:space="preserve">atomicity</w:t>
+      </w:r>
+      <w:r>
+        <w:t xml:space="preserve"> </w:t>
+      </w:r>
+      <w:r>
+        <w:t xml:space="preserve">(regenerated outputs are</w:t>
+      </w:r>
+      <w:r>
+        <w:t xml:space="preserve"> </w:t>
+      </w:r>
+      <w:r>
+        <w:t xml:space="preserve">staged in-memory and written only after the whole run succeeds; any</w:t>
+      </w:r>
+      <w:r>
+        <w:t xml:space="preserve"> </w:t>
+      </w:r>
+      <w:r>
+        <w:t xml:space="preserve">transform error rolls back with zero partial writes — composes with §9.2),</w:t>
+      </w:r>
+      <w:r>
+        <w:t xml:space="preserve"> </w:t>
+      </w:r>
+      <w:r>
+        <w:rPr>
+          <w:b/>
+          <w:bCs/>
+        </w:rPr>
+        <w:t xml:space="preserve">cycle-guard</w:t>
+      </w:r>
+      <w:r>
+        <w:t xml:space="preserve"> </w:t>
+      </w:r>
+      <w:r>
+        <w:t xml:space="preserve">(refuses to run when</w:t>
+      </w:r>
+      <w:r>
+        <w:t xml:space="preserve"> </w:t>
+      </w:r>
+      <w:r>
+        <w:rPr>
+          <w:rStyle w:val="VerbatimChar"/>
+        </w:rPr>
+        <w:t xml:space="preserve">graph.Validate</w:t>
+      </w:r>
+      <w:r>
+        <w:t xml:space="preserve"> </w:t>
+      </w:r>
+      <w:r>
+        <w:t xml:space="preserve">reports a</w:t>
+      </w:r>
+      <w:r>
+        <w:t xml:space="preserve"> </w:t>
+      </w:r>
+      <w:r>
+        <w:rPr>
+          <w:rStyle w:val="VerbatimChar"/>
+        </w:rPr>
+        <w:t xml:space="preserve">CycleError</w:t>
+      </w:r>
+      <w:r>
+        <w:t xml:space="preserve">, writing nothing), and</w:t>
+      </w:r>
+      <w:r>
+        <w:t xml:space="preserve"> </w:t>
+      </w:r>
+      <w:r>
+        <w:rPr>
+          <w:b/>
+          <w:bCs/>
+        </w:rPr>
+        <w:t xml:space="preserve">sync-conflict</w:t>
+      </w:r>
+      <w:r>
+        <w:t xml:space="preserve"> </w:t>
+      </w:r>
+      <w:r>
+        <w:t xml:space="preserve">surfacing</w:t>
+      </w:r>
+      <w:r>
+        <w:t xml:space="preserve"> </w:t>
+      </w:r>
+      <w:r>
+        <w:t xml:space="preserve">(</w:t>
+      </w:r>
+      <w:r>
+        <w:rPr>
+          <w:rStyle w:val="VerbatimChar"/>
+        </w:rPr>
+        <w:t xml:space="preserve">ConflictError</w:t>
+      </w:r>
+      <w:r>
+        <w:t xml:space="preserve"> </w:t>
+      </w:r>
+      <w:r>
+        <w:t xml:space="preserve">on a both-dirty sync pair, writing nothing). It returns the</w:t>
+      </w:r>
+      <w:r>
+        <w:t xml:space="preserve"> </w:t>
+      </w:r>
+      <w:r>
+        <w:rPr>
+          <w:rStyle w:val="VerbatimChar"/>
+        </w:rPr>
+        <w:t xml:space="preserve">RecomputeResult</w:t>
+      </w:r>
+      <w:r>
+        <w:t xml:space="preserve"> </w:t>
+      </w:r>
+      <w:r>
+        <w:t xml:space="preserve">plus a committed / rolled-back / in-sync / conflict /</w:t>
+      </w:r>
+      <w:r>
+        <w:t xml:space="preserve"> </w:t>
+      </w:r>
+      <w:r>
+        <w:t xml:space="preserve">cycle</w:t>
+      </w:r>
+      <w:r>
+        <w:t xml:space="preserve"> </w:t>
+      </w:r>
+      <w:r>
+        <w:rPr>
+          <w:rStyle w:val="VerbatimChar"/>
+        </w:rPr>
+        <w:t xml:space="preserve">Status</w:t>
+      </w:r>
+      <w:r>
+        <w:t xml:space="preserve">. A staged intermediate feeds the next transform, so</w:t>
+      </w:r>
+      <w:r>
+        <w:t xml:space="preserve"> </w:t>
+      </w:r>
+      <w:r>
+        <w:t xml:space="preserve">multi-level chains (md→html→pdf) propagate in one pass.</w:t>
+      </w:r>
+    </w:p>
+    <w:bookmarkEnd w:id="10"/>
+    <w:bookmarkStart w:id="11" w:name="X9d10c453e8d8b6f28872937ca465984758708e5"/>
+    <w:p>
+      <w:pPr>
+        <w:pStyle w:val="Heading3"/>
+      </w:pPr>
+      <w:r>
+        <w:t xml:space="preserve">What is PLANNED (NOT yet functional — do not assume working behaviour)</w:t>
+      </w:r>
+    </w:p>
+    <w:p>
+      <w:pPr>
         <w:pStyle w:val="FirstParagraph"/>
       </w:pPr>
       <w:r>
@@ -1022,31 +1596,19 @@
         <w:t xml:space="preserve"> </w:t>
       </w:r>
       <w:r>
-        <w:t xml:space="preserve">CLI/daemon, on-disk node adapters (Markdown→HTML/PDF/DOCX</w:t>
-      </w:r>
-      <w:r>
-        <w:t xml:space="preserve"> </w:t>
-      </w:r>
-      <w:r>
-        <w:t xml:space="preserve">transforms, SQLite store), the atomic-rename + SQLite-transaction commit</w:t>
-      </w:r>
-      <w:r>
-        <w:t xml:space="preserve"> </w:t>
-      </w:r>
-      <w:r>
-        <w:t xml:space="preserve">layer, per-context YAML config loading, and the constitution-submodule</w:t>
-      </w:r>
-      <w:r>
-        <w:t xml:space="preserve"> </w:t>
-      </w:r>
-      <w:r>
-        <w:t xml:space="preserve">integration are owned by Phases 2–7 and are NOT implemented in this repo</w:t>
-      </w:r>
-      <w:r>
-        <w:t xml:space="preserve"> </w:t>
-      </w:r>
-      <w:r>
-        <w:t xml:space="preserve">yet. The</w:t>
+        <w:t xml:space="preserve">CLI/daemon, per-context YAML config loading, the comprehensive</w:t>
+      </w:r>
+      <w:r>
+        <w:t xml:space="preserve"> </w:t>
+      </w:r>
+      <w:r>
+        <w:t xml:space="preserve">beyond-package test suite, and the constitution-submodule integration are</w:t>
+      </w:r>
+      <w:r>
+        <w:t xml:space="preserve"> </w:t>
+      </w:r>
+      <w:r>
+        <w:t xml:space="preserve">owned by Phases 4–7 and are NOT implemented in this repo yet. The</w:t>
       </w:r>
       <w:r>
         <w:t xml:space="preserve"> </w:t>
@@ -1078,12 +1640,13 @@
     <w:tbl>
       <w:tblPr>
         <w:tblStyle w:val="Table"/>
-        <w:tblW w:type="auto" w:w="0"/>
+        <w:tblW w:type="pct" w:w="5000"/>
+        <w:tblLayout w:type="fixed"/>
         <w:tblLook w:firstRow="1" w:lastRow="0" w:firstColumn="0" w:lastColumn="0" w:noHBand="0" w:noVBand="0" w:val="0020"/>
       </w:tblPr>
       <w:tblGrid>
-        <w:gridCol w:w="3960"/>
-        <w:gridCol w:w="3960"/>
+        <w:gridCol w:w="4168"/>
+        <w:gridCol w:w="3751"/>
       </w:tblGrid>
       <w:tr>
         <w:trPr>
@@ -1772,7 +2335,7 @@
         <w:t xml:space="preserve"> </w:t>
       </w:r>
       <w:r>
-        <w:t xml:space="preserve">consuming project's research tree at</w:t>
+        <w:t xml:space="preserve">consuming project’s research tree at</w:t>
       </w:r>
       <w:r>
         <w:t xml:space="preserve"> </w:t>

</xml_diff>

<commit_message>
docs: rename project name docs_chain→Docs Chain in prose (identifiers/paths/module/URLs/CLI preserved); regenerate md/html/pdf/docx exports + revision headers
</commit_message>
<xml_diff>
--- a/README.docx
+++ b/README.docx
@@ -2,13 +2,13 @@
 <file path=word/document.xml><?xml version="1.0" encoding="utf-8"?>
 <w:document xmlns:w="http://schemas.openxmlformats.org/wordprocessingml/2006/main" xmlns:m="http://schemas.openxmlformats.org/officeDocument/2006/math" xmlns:r="http://schemas.openxmlformats.org/officeDocument/2006/relationships" xmlns:o="urn:schemas-microsoft-com:office:office" xmlns:v="urn:schemas-microsoft-com:vml" xmlns:w10="urn:schemas-microsoft-com:office:word" xmlns:a="http://schemas.openxmlformats.org/drawingml/2006/main" xmlns:pic="http://schemas.openxmlformats.org/drawingml/2006/picture" xmlns:wp="http://schemas.openxmlformats.org/drawingml/2006/wordprocessingDrawing">
   <w:body>
-    <w:bookmarkStart w:id="22" w:name="docs_chain"/>
+    <w:bookmarkStart w:id="22" w:name="docs-chain"/>
     <w:p>
       <w:pPr>
         <w:pStyle w:val="Heading1"/>
       </w:pPr>
       <w:r>
-        <w:t xml:space="preserve">docs_chain</w:t>
+        <w:t xml:space="preserve">Docs Chain</w:t>
       </w:r>
     </w:p>
     <w:p>
@@ -26,7 +26,7 @@
         <w:t xml:space="preserve"> </w:t>
       </w:r>
       <w:r>
-        <w:t xml:space="preserve">2</w:t>
+        <w:t xml:space="preserve">3</w:t>
       </w:r>
       <w:r>
         <w:t xml:space="preserve"> </w:t>
@@ -42,7 +42,7 @@
         <w:t xml:space="preserve"> </w:t>
       </w:r>
       <w:r>
-        <w:t xml:space="preserve">2026-05-29T09:30:00Z</w:t>
+        <w:t xml:space="preserve">2026-05-29T12:00:00Z</w:t>
       </w:r>
       <w:r>
         <w:t xml:space="preserve"> </w:t>
@@ -161,7 +161,7 @@
         <w:t xml:space="preserve"> </w:t>
       </w:r>
       <w:r>
-        <w:t xml:space="preserve">Operator mandate 2026-05-29 (docs_chain initiative)</w:t>
+        <w:t xml:space="preserve">Operator mandate 2026-05-29 (Docs Chain initiative)</w:t>
       </w:r>
     </w:p>
     <w:p>
@@ -176,7 +176,7 @@
         <w:pStyle w:val="FirstParagraph"/>
       </w:pPr>
       <w:r>
-        <w:t xml:space="preserve">docs_chain is a universal, Go-implemented,</w:t>
+        <w:t xml:space="preserve">Docs Chain is a universal, Go-implemented,</w:t>
       </w:r>
       <w:r>
         <w:t xml:space="preserve"> </w:t>
@@ -215,7 +215,7 @@
         <w:t xml:space="preserve"> </w:t>
       </w:r>
       <w:r>
-        <w:t xml:space="preserve">SQLite database — docs_chain detects the change by</w:t>
+        <w:t xml:space="preserve">SQLite database — Docs Chain detects the change by</w:t>
       </w:r>
       <w:r>
         <w:t xml:space="preserve"> </w:t>
@@ -1869,7 +1869,7 @@
               <w:pStyle w:val="Compact"/>
             </w:pPr>
             <w:r>
-              <w:t xml:space="preserve">How the constitution submodule makes docs_chain available to every consuming project — inheritance model, config discovery, the §11.4.x anchors it satisfies, what a project gets for free vs must register.</w:t>
+              <w:t xml:space="preserve">How the constitution submodule makes Docs Chain available to every consuming project — inheritance model, config discovery, the §11.4.x anchors it satisfies, what a project gets for free vs must register.</w:t>
             </w:r>
           </w:p>
         </w:tc>

</xml_diff>

<commit_message>
docs: regenerate self-docs siblings via `docs_chain sync` after the Phase-4/5 doc updates
Dogfooding the drift gate on docs_chain's own corpus: the PLANNED→IMPLEMENTED
markdown edits in 80d3d8d (README + USER_GUIDE + CONFIG_SCHEMA +
CONSTITUTION_INTEGRATION) left their committed html/pdf/docx siblings stale —
`docs_chain verify self-docs` reported 8 STALE nodes. Regenerated them with the
real binary (`docs_chain sync self-docs`); `verify self-docs` now exits 0
(in-sync). Same fix being applied to the downstream Herald corpus. No source
changes — derived artefacts only.

Co-Authored-By: Claude Opus 4.8 <noreply@anthropic.com>
</commit_message>
<xml_diff>
--- a/README.docx
+++ b/README.docx
@@ -251,7 +251,7 @@
         </w:r>
       </w:hyperlink>
       <w:r>
-        <w:t xml:space="preserve">). The Phase-4 fsnotify</w:t>
+        <w:t xml:space="preserve">). The fsnotify</w:t>
       </w:r>
       <w:r>
         <w:t xml:space="preserve"> </w:t>
@@ -266,7 +266,107 @@
         <w:t xml:space="preserve"> </w:t>
       </w:r>
       <w:r>
-        <w:t xml:space="preserve">daemon and Phases 5–7 remain PLANNED. This README and the docs under</w:t>
+        <w:t xml:space="preserve">daemon, the generic bidirectional</w:t>
+      </w:r>
+      <w:r>
+        <w:t xml:space="preserve"> </w:t>
+      </w:r>
+      <w:r>
+        <w:rPr>
+          <w:rStyle w:val="VerbatimChar"/>
+        </w:rPr>
+        <w:t xml:space="preserve">md-to-sqlite</w:t>
+      </w:r>
+      <w:r>
+        <w:t xml:space="preserve"> </w:t>
+      </w:r>
+      <w:r>
+        <w:t xml:space="preserve">/</w:t>
+      </w:r>
+      <w:r>
+        <w:t xml:space="preserve"> </w:t>
+      </w:r>
+      <w:r>
+        <w:rPr>
+          <w:rStyle w:val="VerbatimChar"/>
+        </w:rPr>
+        <w:t xml:space="preserve">sqlite-to-md</w:t>
+      </w:r>
+      <w:r>
+        <w:t xml:space="preserve"> </w:t>
+      </w:r>
+      <w:r>
+        <w:t xml:space="preserve">DB builtins, the</w:t>
+      </w:r>
+      <w:r>
+        <w:t xml:space="preserve"> </w:t>
+      </w:r>
+      <w:r>
+        <w:rPr>
+          <w:rStyle w:val="VerbatimChar"/>
+        </w:rPr>
+        <w:t xml:space="preserve">colorize-html</w:t>
+      </w:r>
+      <w:r>
+        <w:t xml:space="preserve"> </w:t>
+      </w:r>
+      <w:r>
+        <w:t xml:space="preserve">(§11.4.23) builtin, and the comprehensive test suite (Phase 5 — real-binary subprocess e2e + watch full-automation +</w:t>
+      </w:r>
+      <w:r>
+        <w:t xml:space="preserve"> </w:t>
+      </w:r>
+      <w:r>
+        <w:rPr>
+          <w:rStyle w:val="VerbatimChar"/>
+        </w:rPr>
+        <w:t xml:space="preserve">scripts/e2e.sh</w:t>
+      </w:r>
+      <w:r>
+        <w:t xml:space="preserve">) are now</w:t>
+      </w:r>
+      <w:r>
+        <w:t xml:space="preserve"> </w:t>
+      </w:r>
+      <w:r>
+        <w:rPr>
+          <w:b/>
+          <w:bCs/>
+        </w:rPr>
+        <w:t xml:space="preserve">IMPLEMENTED + tested</w:t>
+      </w:r>
+      <w:r>
+        <w:t xml:space="preserve"> </w:t>
+      </w:r>
+      <w:r>
+        <w:t xml:space="preserve">(</w:t>
+      </w:r>
+      <w:r>
+        <w:rPr>
+          <w:rStyle w:val="VerbatimChar"/>
+        </w:rPr>
+        <w:t xml:space="preserve">go test -race ./...</w:t>
+      </w:r>
+      <w:r>
+        <w:t xml:space="preserve"> </w:t>
+      </w:r>
+      <w:r>
+        <w:t xml:space="preserve">passes;</w:t>
+      </w:r>
+      <w:r>
+        <w:t xml:space="preserve"> </w:t>
+      </w:r>
+      <w:r>
+        <w:rPr>
+          <w:rStyle w:val="VerbatimChar"/>
+        </w:rPr>
+        <w:t xml:space="preserve">scripts/e2e.sh</w:t>
+      </w:r>
+      <w:r>
+        <w:t xml:space="preserve"> </w:t>
+      </w:r>
+      <w:r>
+        <w:t xml:space="preserve">is GREEN, 20/0). Phase 6 (constitution-submodule distribution) + Phase 7 (ATMOSphere wiring) remain PLANNED — OPERATOR-GATED (remote-repo creation / cross-repo). This README and the docs under</w:t>
       </w:r>
       <w:r>
         <w:t xml:space="preserve"> </w:t>
@@ -755,7 +855,22 @@
               <w:pStyle w:val="Compact"/>
             </w:pPr>
             <w:r>
-              <w:t xml:space="preserve">Config-driven multi-context + CLI</w:t>
+              <w:t xml:space="preserve">Config-driven multi-context + CLI +</w:t>
+            </w:r>
+            <w:r>
+              <w:t xml:space="preserve"> </w:t>
+            </w:r>
+            <w:r>
+              <w:rPr>
+                <w:rStyle w:val="VerbatimChar"/>
+              </w:rPr>
+              <w:t xml:space="preserve">watch</w:t>
+            </w:r>
+            <w:r>
+              <w:t xml:space="preserve"> </w:t>
+            </w:r>
+            <w:r>
+              <w:t xml:space="preserve">daemon</w:t>
             </w:r>
           </w:p>
         </w:tc>
@@ -863,10 +978,7 @@
               <w:t xml:space="preserve">graph</w:t>
             </w:r>
             <w:r>
-              <w:t xml:space="preserve">). The fsnotify</w:t>
-            </w:r>
-            <w:r>
-              <w:t xml:space="preserve"> </w:t>
+              <w:t xml:space="preserve">/</w:t>
             </w:r>
             <w:r>
               <w:rPr>
@@ -875,10 +987,22 @@
               <w:t xml:space="preserve">watch</w:t>
             </w:r>
             <w:r>
+              <w:t xml:space="preserve">; fsnotify daemon proven by</w:t>
+            </w:r>
+            <w:r>
               <w:t xml:space="preserve"> </w:t>
             </w:r>
             <w:r>
-              <w:t xml:space="preserve">daemon remains PLANNED.</w:t>
+              <w:rPr>
+                <w:rStyle w:val="VerbatimChar"/>
+              </w:rPr>
+              <w:t xml:space="preserve">cmd/docs_chain/watch_test.go</w:t>
+            </w:r>
+            <w:r>
+              <w:t xml:space="preserve"> </w:t>
+            </w:r>
+            <w:r>
+              <w:t xml:space="preserve">full-automation).</w:t>
             </w:r>
           </w:p>
         </w:tc>
@@ -891,7 +1015,7 @@
               <w:pStyle w:val="Compact"/>
             </w:pPr>
             <w:r>
-              <w:t xml:space="preserve">5</w:t>
+              <w:t xml:space="preserve">4b</w:t>
             </w:r>
           </w:p>
         </w:tc>
@@ -902,7 +1026,16 @@
               <w:pStyle w:val="Compact"/>
             </w:pPr>
             <w:r>
-              <w:t xml:space="preserve">Comprehensive test suite (beyond the Phase 1–3 package tests)</w:t>
+              <w:t xml:space="preserve">Generic DB builtins +</w:t>
+            </w:r>
+            <w:r>
+              <w:t xml:space="preserve"> </w:t>
+            </w:r>
+            <w:r>
+              <w:rPr>
+                <w:rStyle w:val="VerbatimChar"/>
+              </w:rPr>
+              <w:t xml:space="preserve">colorize-html</w:t>
             </w:r>
           </w:p>
         </w:tc>
@@ -913,7 +1046,56 @@
               <w:pStyle w:val="Compact"/>
             </w:pPr>
             <w:r>
-              <w:t xml:space="preserve">PLANNED</w:t>
+              <w:rPr>
+                <w:b/>
+                <w:bCs/>
+              </w:rPr>
+              <w:t xml:space="preserve">IMPLEMENTED + tested</w:t>
+            </w:r>
+            <w:r>
+              <w:t xml:space="preserve"> </w:t>
+            </w:r>
+            <w:r>
+              <w:t xml:space="preserve">— bidirectional</w:t>
+            </w:r>
+            <w:r>
+              <w:t xml:space="preserve"> </w:t>
+            </w:r>
+            <w:r>
+              <w:rPr>
+                <w:rStyle w:val="VerbatimChar"/>
+              </w:rPr>
+              <w:t xml:space="preserve">md-to-sqlite</w:t>
+            </w:r>
+            <w:r>
+              <w:t xml:space="preserve">/</w:t>
+            </w:r>
+            <w:r>
+              <w:rPr>
+                <w:rStyle w:val="VerbatimChar"/>
+              </w:rPr>
+              <w:t xml:space="preserve">sqlite-to-md</w:t>
+            </w:r>
+            <w:r>
+              <w:t xml:space="preserve"> </w:t>
+            </w:r>
+            <w:r>
+              <w:t xml:space="preserve">(pure-Go modernc, row-level drift, byte-stable round-trip) +</w:t>
+            </w:r>
+            <w:r>
+              <w:t xml:space="preserve"> </w:t>
+            </w:r>
+            <w:r>
+              <w:rPr>
+                <w:rStyle w:val="VerbatimChar"/>
+              </w:rPr>
+              <w:t xml:space="preserve">colorize-html</w:t>
+            </w:r>
+            <w:r>
+              <w:t xml:space="preserve"> </w:t>
+            </w:r>
+            <w:r>
+              <w:t xml:space="preserve">(§11.4.23 cell-color matrix).</w:t>
             </w:r>
           </w:p>
         </w:tc>
@@ -926,7 +1108,7 @@
               <w:pStyle w:val="Compact"/>
             </w:pPr>
             <w:r>
-              <w:t xml:space="preserve">6</w:t>
+              <w:t xml:space="preserve">5</w:t>
             </w:r>
           </w:p>
         </w:tc>
@@ -937,7 +1119,7 @@
               <w:pStyle w:val="Compact"/>
             </w:pPr>
             <w:r>
-              <w:t xml:space="preserve">Constitution-submodule integration + repo creation</w:t>
+              <w:t xml:space="preserve">Comprehensive test suite (real-binary e2e + full-automation)</w:t>
             </w:r>
           </w:p>
         </w:tc>
@@ -948,7 +1130,86 @@
               <w:pStyle w:val="Compact"/>
             </w:pPr>
             <w:r>
-              <w:t xml:space="preserve">PLANNED — OPERATOR-GATED</w:t>
+              <w:rPr>
+                <w:b/>
+                <w:bCs/>
+              </w:rPr>
+              <w:t xml:space="preserve">IMPLEMENTED</w:t>
+            </w:r>
+            <w:r>
+              <w:t xml:space="preserve"> </w:t>
+            </w:r>
+            <w:r>
+              <w:t xml:space="preserve">—</w:t>
+            </w:r>
+            <w:r>
+              <w:t xml:space="preserve"> </w:t>
+            </w:r>
+            <w:r>
+              <w:rPr>
+                <w:rStyle w:val="VerbatimChar"/>
+              </w:rPr>
+              <w:t xml:space="preserve">cmd/docs_chain/e2e_test.go</w:t>
+            </w:r>
+            <w:r>
+              <w:t xml:space="preserve"> </w:t>
+            </w:r>
+            <w:r>
+              <w:t xml:space="preserve">(subprocess across every subcommand + exit-code contract),</w:t>
+            </w:r>
+            <w:r>
+              <w:t xml:space="preserve"> </w:t>
+            </w:r>
+            <w:r>
+              <w:rPr>
+                <w:rStyle w:val="VerbatimChar"/>
+              </w:rPr>
+              <w:t xml:space="preserve">watch_test.go</w:t>
+            </w:r>
+            <w:r>
+              <w:t xml:space="preserve"> </w:t>
+            </w:r>
+            <w:r>
+              <w:t xml:space="preserve">(daemon),</w:t>
+            </w:r>
+            <w:r>
+              <w:t xml:space="preserve"> </w:t>
+            </w:r>
+            <w:r>
+              <w:rPr>
+                <w:rStyle w:val="VerbatimChar"/>
+              </w:rPr>
+              <w:t xml:space="preserve">internal/runner/sqlite_runner_test.go</w:t>
+            </w:r>
+            <w:r>
+              <w:t xml:space="preserve">,</w:t>
+            </w:r>
+            <w:r>
+              <w:t xml:space="preserve"> </w:t>
+            </w:r>
+            <w:r>
+              <w:rPr>
+                <w:rStyle w:val="VerbatimChar"/>
+              </w:rPr>
+              <w:t xml:space="preserve">scripts/e2e.sh</w:t>
+            </w:r>
+            <w:r>
+              <w:t xml:space="preserve"> </w:t>
+            </w:r>
+            <w:r>
+              <w:t xml:space="preserve">(20/0 GREEN, captured transcript under</w:t>
+            </w:r>
+            <w:r>
+              <w:t xml:space="preserve"> </w:t>
+            </w:r>
+            <w:r>
+              <w:rPr>
+                <w:rStyle w:val="VerbatimChar"/>
+              </w:rPr>
+              <w:t xml:space="preserve">qa-results/docs_chain/</w:t>
+            </w:r>
+            <w:r>
+              <w:t xml:space="preserve">).</w:t>
             </w:r>
           </w:p>
         </w:tc>
@@ -961,6 +1222,41 @@
               <w:pStyle w:val="Compact"/>
             </w:pPr>
             <w:r>
+              <w:t xml:space="preserve">6</w:t>
+            </w:r>
+          </w:p>
+        </w:tc>
+        <w:tc>
+          <w:tcPr/>
+          <w:p>
+            <w:pPr>
+              <w:pStyle w:val="Compact"/>
+            </w:pPr>
+            <w:r>
+              <w:t xml:space="preserve">Constitution-submodule integration + repo creation</w:t>
+            </w:r>
+          </w:p>
+        </w:tc>
+        <w:tc>
+          <w:tcPr/>
+          <w:p>
+            <w:pPr>
+              <w:pStyle w:val="Compact"/>
+            </w:pPr>
+            <w:r>
+              <w:t xml:space="preserve">PLANNED — OPERATOR-GATED</w:t>
+            </w:r>
+          </w:p>
+        </w:tc>
+      </w:tr>
+      <w:tr>
+        <w:tc>
+          <w:tcPr/>
+          <w:p>
+            <w:pPr>
+              <w:pStyle w:val="Compact"/>
+            </w:pPr>
+            <w:r>
               <w:t xml:space="preserve">7</w:t>
             </w:r>
           </w:p>
@@ -2357,10 +2653,147 @@
         <w:pStyle w:val="FirstParagraph"/>
       </w:pPr>
       <w:r>
-        <w:t xml:space="preserve">The fsnotify</w:t>
-      </w:r>
-      <w:r>
-        <w:t xml:space="preserve"> </w:t>
+        <w:t xml:space="preserve">Only the</w:t>
+      </w:r>
+      <w:r>
+        <w:t xml:space="preserve"> </w:t>
+      </w:r>
+      <w:r>
+        <w:rPr>
+          <w:b/>
+          <w:bCs/>
+        </w:rPr>
+        <w:t xml:space="preserve">distribution / wiring</w:t>
+      </w:r>
+      <w:r>
+        <w:t xml:space="preserve"> </w:t>
+      </w:r>
+      <w:r>
+        <w:t xml:space="preserve">phases remain, and they are OPERATOR-GATED</w:t>
+      </w:r>
+      <w:r>
+        <w:t xml:space="preserve"> </w:t>
+      </w:r>
+      <w:r>
+        <w:t xml:space="preserve">(an agent must not create remotes or add submodule pointers — §11.4.66):</w:t>
+      </w:r>
+    </w:p>
+    <w:p>
+      <w:pPr>
+        <w:pStyle w:val="Compact"/>
+        <w:numPr>
+          <w:ilvl w:val="0"/>
+          <w:numId w:val="1002"/>
+        </w:numPr>
+      </w:pPr>
+      <w:r>
+        <w:rPr>
+          <w:b/>
+          <w:bCs/>
+        </w:rPr>
+        <w:t xml:space="preserve">Phase 6</w:t>
+      </w:r>
+      <w:r>
+        <w:t xml:space="preserve"> </w:t>
+      </w:r>
+      <w:r>
+        <w:t xml:space="preserve">— constitution-submodule integration + repo creation: publish</w:t>
+      </w:r>
+      <w:r>
+        <w:t xml:space="preserve"> </w:t>
+      </w:r>
+      <w:r>
+        <w:rPr>
+          <w:rStyle w:val="VerbatimChar"/>
+        </w:rPr>
+        <w:t xml:space="preserve">vasic-digital/docs_chain</w:t>
+      </w:r>
+      <w:r>
+        <w:t xml:space="preserve"> </w:t>
+      </w:r>
+      <w:r>
+        <w:t xml:space="preserve">and add it as a submodule of the constitution so</w:t>
+      </w:r>
+      <w:r>
+        <w:t xml:space="preserve"> </w:t>
+      </w:r>
+      <w:r>
+        <w:t xml:space="preserve">consumers inherit the engine by-reference at the constitution-exposed path.</w:t>
+      </w:r>
+    </w:p>
+    <w:p>
+      <w:pPr>
+        <w:pStyle w:val="Compact"/>
+        <w:numPr>
+          <w:ilvl w:val="0"/>
+          <w:numId w:val="1002"/>
+        </w:numPr>
+      </w:pPr>
+      <w:r>
+        <w:rPr>
+          <w:b/>
+          <w:bCs/>
+        </w:rPr>
+        <w:t xml:space="preserve">Phase 7</w:t>
+      </w:r>
+      <w:r>
+        <w:t xml:space="preserve"> </w:t>
+      </w:r>
+      <w:r>
+        <w:t xml:space="preserve">— register the ATMOSphere contexts + retire that project’s</w:t>
+      </w:r>
+      <w:r>
+        <w:t xml:space="preserve"> </w:t>
+      </w:r>
+      <w:r>
+        <w:t xml:space="preserve">remaining ad-hoc doc-sync scripts.</w:t>
+      </w:r>
+    </w:p>
+    <w:p>
+      <w:pPr>
+        <w:pStyle w:val="FirstParagraph"/>
+      </w:pPr>
+      <w:r>
+        <w:t xml:space="preserve">The engine itself is feature-complete:</w:t>
+      </w:r>
+      <w:r>
+        <w:t xml:space="preserve"> </w:t>
+      </w:r>
+      <w:r>
+        <w:rPr>
+          <w:rStyle w:val="VerbatimChar"/>
+        </w:rPr>
+        <w:t xml:space="preserve">sync</w:t>
+      </w:r>
+      <w:r>
+        <w:t xml:space="preserve">/</w:t>
+      </w:r>
+      <w:r>
+        <w:rPr>
+          <w:rStyle w:val="VerbatimChar"/>
+        </w:rPr>
+        <w:t xml:space="preserve">verify</w:t>
+      </w:r>
+      <w:r>
+        <w:t xml:space="preserve">/</w:t>
+      </w:r>
+      <w:r>
+        <w:rPr>
+          <w:rStyle w:val="VerbatimChar"/>
+        </w:rPr>
+        <w:t xml:space="preserve">doctor</w:t>
+      </w:r>
+      <w:r>
+        <w:t xml:space="preserve">/</w:t>
+      </w:r>
+      <w:r>
+        <w:rPr>
+          <w:rStyle w:val="VerbatimChar"/>
+        </w:rPr>
+        <w:t xml:space="preserve">graph</w:t>
+      </w:r>
+      <w:r>
+        <w:t xml:space="preserve">/</w:t>
       </w:r>
       <w:r>
         <w:rPr>
@@ -2369,34 +2802,100 @@
         <w:t xml:space="preserve">watch</w:t>
       </w:r>
       <w:r>
-        <w:t xml:space="preserve"> </w:t>
-      </w:r>
-      <w:r>
-        <w:t xml:space="preserve">daemon (Phase 4 —</w:t>
-      </w:r>
-      <w:r>
-        <w:t xml:space="preserve"> </w:t>
-      </w:r>
-      <w:r>
-        <w:rPr>
-          <w:rStyle w:val="VerbatimChar"/>
-        </w:rPr>
-        <w:t xml:space="preserve">docs_chain watch</w:t>
-      </w:r>
-      <w:r>
-        <w:t xml:space="preserve">), the comprehensive</w:t>
-      </w:r>
-      <w:r>
-        <w:t xml:space="preserve"> </w:t>
-      </w:r>
-      <w:r>
-        <w:t xml:space="preserve">beyond-package test suite (Phase 5), and the constitution-submodule</w:t>
-      </w:r>
-      <w:r>
-        <w:t xml:space="preserve"> </w:t>
-      </w:r>
-      <w:r>
-        <w:t xml:space="preserve">integration (Phases 6–7) are NOT implemented in this repo yet. The</w:t>
+        <w:t xml:space="preserve">,</w:t>
+      </w:r>
+      <w:r>
+        <w:t xml:space="preserve"> </w:t>
+      </w:r>
+      <w:r>
+        <w:t xml:space="preserve">all builtins (</w:t>
+      </w:r>
+      <w:r>
+        <w:rPr>
+          <w:rStyle w:val="VerbatimChar"/>
+        </w:rPr>
+        <w:t xml:space="preserve">pandoc-html</w:t>
+      </w:r>
+      <w:r>
+        <w:t xml:space="preserve">/</w:t>
+      </w:r>
+      <w:r>
+        <w:rPr>
+          <w:rStyle w:val="VerbatimChar"/>
+        </w:rPr>
+        <w:t xml:space="preserve">weasyprint-pdf</w:t>
+      </w:r>
+      <w:r>
+        <w:t xml:space="preserve">/</w:t>
+      </w:r>
+      <w:r>
+        <w:rPr>
+          <w:rStyle w:val="VerbatimChar"/>
+        </w:rPr>
+        <w:t xml:space="preserve">pandoc-docx</w:t>
+      </w:r>
+      <w:r>
+        <w:t xml:space="preserve">/</w:t>
+      </w:r>
+      <w:r>
+        <w:rPr>
+          <w:rStyle w:val="VerbatimChar"/>
+        </w:rPr>
+        <w:t xml:space="preserve">members-fingerprint</w:t>
+      </w:r>
+      <w:r>
+        <w:t xml:space="preserve">/</w:t>
+      </w:r>
+      <w:r>
+        <w:t xml:space="preserve"> </w:t>
+      </w:r>
+      <w:r>
+        <w:rPr>
+          <w:rStyle w:val="VerbatimChar"/>
+        </w:rPr>
+        <w:t xml:space="preserve">md-to-sqlite</w:t>
+      </w:r>
+      <w:r>
+        <w:t xml:space="preserve">/</w:t>
+      </w:r>
+      <w:r>
+        <w:rPr>
+          <w:rStyle w:val="VerbatimChar"/>
+        </w:rPr>
+        <w:t xml:space="preserve">sqlite-to-md</w:t>
+      </w:r>
+      <w:r>
+        <w:t xml:space="preserve">/</w:t>
+      </w:r>
+      <w:r>
+        <w:rPr>
+          <w:rStyle w:val="VerbatimChar"/>
+        </w:rPr>
+        <w:t xml:space="preserve">colorize-html</w:t>
+      </w:r>
+      <w:r>
+        <w:t xml:space="preserve">), and</w:t>
+      </w:r>
+      <w:r>
+        <w:t xml:space="preserve"> </w:t>
+      </w:r>
+      <w:r>
+        <w:rPr>
+          <w:rStyle w:val="VerbatimChar"/>
+        </w:rPr>
+        <w:t xml:space="preserve">exec:</w:t>
+      </w:r>
+      <w:r>
+        <w:t xml:space="preserve"> </w:t>
+      </w:r>
+      <w:r>
+        <w:t xml:space="preserve">transforms are</w:t>
+      </w:r>
+      <w:r>
+        <w:t xml:space="preserve"> </w:t>
+      </w:r>
+      <w:r>
+        <w:t xml:space="preserve">IMPLEMENTED + tested.</w:t>
       </w:r>
       <w:r>
         <w:t xml:space="preserve"> </w:t>
@@ -2411,52 +2910,7 @@
         <w:t xml:space="preserve"> </w:t>
       </w:r>
       <w:r>
-        <w:t xml:space="preserve">pages describe their DESIGNED contract.</w:t>
-      </w:r>
-      <w:r>
-        <w:t xml:space="preserve"> </w:t>
-      </w:r>
-      <w:r>
-        <w:rPr>
-          <w:rStyle w:val="VerbatimChar"/>
-        </w:rPr>
-        <w:t xml:space="preserve">docs_chain watch</w:t>
-      </w:r>
-      <w:r>
-        <w:t xml:space="preserve"> </w:t>
-      </w:r>
-      <w:r>
-        <w:t xml:space="preserve">is not wired; use</w:t>
-      </w:r>
-      <w:r>
-        <w:t xml:space="preserve"> </w:t>
-      </w:r>
-      <w:r>
-        <w:rPr>
-          <w:rStyle w:val="VerbatimChar"/>
-        </w:rPr>
-        <w:t xml:space="preserve">sync</w:t>
-      </w:r>
-      <w:r>
-        <w:t xml:space="preserve"> </w:t>
-      </w:r>
-      <w:r>
-        <w:t xml:space="preserve">/</w:t>
-      </w:r>
-      <w:r>
-        <w:t xml:space="preserve"> </w:t>
-      </w:r>
-      <w:r>
-        <w:rPr>
-          <w:rStyle w:val="VerbatimChar"/>
-        </w:rPr>
-        <w:t xml:space="preserve">verify</w:t>
-      </w:r>
-      <w:r>
-        <w:t xml:space="preserve"> </w:t>
-      </w:r>
-      <w:r>
-        <w:t xml:space="preserve">on demand.</w:t>
+        <w:t xml:space="preserve">pages describe Phases 6–7’s DESIGNED contract.</w:t>
       </w:r>
     </w:p>
     <w:bookmarkEnd w:id="12"/>
@@ -3811,6 +4265,9 @@
     <w:abstractNumId w:val="990"/>
   </w:num>
   <w:num w:numId="1001">
+    <w:abstractNumId w:val="991"/>
+  </w:num>
+  <w:num w:numId="1002">
     <w:abstractNumId w:val="991"/>
   </w:num>
 </w:numbering>

</xml_diff>